<commit_message>
Update Mobile Postpaid Activation BRSD process notes
Co-Authored-By: Claude Sonnet 5 <noreply@anthropic.com>
</commit_message>
<xml_diff>
--- a/vfq-diagram-engine/output/vfq-mobile-postpaid-activation-brsd-v1-3/Postpaid-Notes.docx
+++ b/vfq-diagram-engine/output/vfq-mobile-postpaid-activation-brsd-v1-3/Postpaid-Notes.docx
@@ -321,11 +321,15 @@
         <w:pStyle w:val="NormalWeb"/>
         <w:rPr>
           <w:rFonts w:ascii="Tenorite" w:hAnsi="Tenorite"/>
+          <w:sz w:val="20"/>
+          <w:szCs w:val="20"/>
         </w:rPr>
       </w:pPr>
       <w:r>
         <w:rPr>
           <w:rFonts w:ascii="Tenorite" w:hAnsi="Tenorite"/>
+          <w:sz w:val="20"/>
+          <w:szCs w:val="20"/>
         </w:rPr>
         <w:t>In a typical contact-</w:t>
       </w:r>
@@ -333,6 +337,8 @@
       <w:r>
         <w:rPr>
           <w:rFonts w:ascii="Tenorite" w:hAnsi="Tenorite"/>
+          <w:sz w:val="20"/>
+          <w:szCs w:val="20"/>
         </w:rPr>
         <w:t>center</w:t>
       </w:r>
@@ -340,6 +346,8 @@
       <w:r>
         <w:rPr>
           <w:rFonts w:ascii="Tenorite" w:hAnsi="Tenorite"/>
+          <w:sz w:val="20"/>
+          <w:szCs w:val="20"/>
         </w:rPr>
         <w:t xml:space="preserve"> flow, Queue/CTI context is auto-populated, not typed by the agent. The Q-Ticket (</w:t>
       </w:r>
@@ -347,6 +355,8 @@
       <w:r>
         <w:rPr>
           <w:rFonts w:ascii="Tenorite" w:hAnsi="Tenorite"/>
+          <w:sz w:val="20"/>
+          <w:szCs w:val="20"/>
         </w:rPr>
         <w:t>Qnomy</w:t>
       </w:r>
@@ -354,6 +364,8 @@
       <w:r>
         <w:rPr>
           <w:rFonts w:ascii="Tenorite" w:hAnsi="Tenorite"/>
+          <w:sz w:val="20"/>
+          <w:szCs w:val="20"/>
         </w:rPr>
         <w:t>) and CTI Call Ref are pushed into the session when the call/chat is routed to the agent’s desktop, so the agent sees them as read-only reference data.</w:t>
       </w:r>
@@ -363,11 +375,15 @@
         <w:pStyle w:val="NormalWeb"/>
         <w:rPr>
           <w:rFonts w:ascii="Tenorite" w:hAnsi="Tenorite"/>
+          <w:sz w:val="20"/>
+          <w:szCs w:val="20"/>
         </w:rPr>
       </w:pPr>
       <w:r>
         <w:rPr>
           <w:rFonts w:ascii="Tenorite" w:hAnsi="Tenorite"/>
+          <w:sz w:val="20"/>
+          <w:szCs w:val="20"/>
         </w:rPr>
         <w:t xml:space="preserve">Right </w:t>
       </w:r>
@@ -375,6 +391,8 @@
       <w:r>
         <w:rPr>
           <w:rFonts w:ascii="Tenorite" w:hAnsi="Tenorite"/>
+          <w:sz w:val="20"/>
+          <w:szCs w:val="20"/>
         </w:rPr>
         <w:t>now</w:t>
       </w:r>
@@ -382,6 +400,8 @@
       <w:r>
         <w:rPr>
           <w:rFonts w:ascii="Tenorite" w:hAnsi="Tenorite"/>
+          <w:sz w:val="20"/>
+          <w:szCs w:val="20"/>
         </w:rPr>
         <w:t xml:space="preserve"> the activation page shows them as editable inputs, which is misleading. I can change that section so the fields appear as read-only, pre-filled values (e.g., </w:t>
       </w:r>
@@ -395,6 +415,8 @@
       <w:r>
         <w:rPr>
           <w:rFonts w:ascii="Tenorite" w:hAnsi="Tenorite"/>
+          <w:sz w:val="20"/>
+          <w:szCs w:val="20"/>
         </w:rPr>
         <w:t xml:space="preserve"> and </w:t>
       </w:r>
@@ -408,6 +430,8 @@
       <w:r>
         <w:rPr>
           <w:rFonts w:ascii="Tenorite" w:hAnsi="Tenorite"/>
+          <w:sz w:val="20"/>
+          <w:szCs w:val="20"/>
         </w:rPr>
         <w:t>) with a “refresh” or “not populated” fallback, or I can remove the inputs entirely and show them as plain metadata.</w:t>
       </w:r>
@@ -448,7 +472,7 @@
             <w:pPr>
               <w:spacing w:after="0" w:line="240" w:lineRule="auto"/>
               <w:rPr>
-                <w:rFonts w:ascii="Tenorite Regular" w:eastAsia="Times New Roman" w:hAnsi="Tenorite Regular" w:cs="Times New Roman"/>
+                <w:rFonts w:eastAsia="Times New Roman" w:cs="Times New Roman"/>
                 <w:b/>
                 <w:bCs/>
                 <w:color w:val="000000"/>
@@ -461,7 +485,7 @@
             </w:pPr>
             <w:r>
               <w:rPr>
-                <w:rFonts w:ascii="Tenorite Regular" w:eastAsia="Times New Roman" w:hAnsi="Tenorite Regular" w:cs="Times New Roman"/>
+                <w:rFonts w:eastAsia="Times New Roman" w:cs="Times New Roman"/>
                 <w:b/>
                 <w:bCs/>
                 <w:color w:val="000000"/>
@@ -492,7 +516,7 @@
             <w:pPr>
               <w:spacing w:after="0" w:line="240" w:lineRule="auto"/>
               <w:rPr>
-                <w:rFonts w:ascii="Tenorite Regular" w:eastAsia="Times New Roman" w:hAnsi="Tenorite Regular" w:cs="Times New Roman"/>
+                <w:rFonts w:eastAsia="Times New Roman" w:cs="Times New Roman"/>
                 <w:b/>
                 <w:bCs/>
                 <w:color w:val="000000"/>
@@ -505,7 +529,7 @@
             </w:pPr>
             <w:r>
               <w:rPr>
-                <w:rFonts w:ascii="Tenorite Regular" w:eastAsia="Times New Roman" w:hAnsi="Tenorite Regular" w:cs="Times New Roman"/>
+                <w:rFonts w:eastAsia="Times New Roman" w:cs="Times New Roman"/>
                 <w:b/>
                 <w:bCs/>
                 <w:color w:val="000000"/>
@@ -536,7 +560,7 @@
             <w:pPr>
               <w:spacing w:after="0" w:line="240" w:lineRule="auto"/>
               <w:rPr>
-                <w:rFonts w:ascii="Tenorite Regular" w:eastAsia="Times New Roman" w:hAnsi="Tenorite Regular" w:cs="Times New Roman"/>
+                <w:rFonts w:eastAsia="Times New Roman" w:cs="Times New Roman"/>
                 <w:b/>
                 <w:bCs/>
                 <w:color w:val="000000"/>
@@ -549,7 +573,7 @@
             </w:pPr>
             <w:r>
               <w:rPr>
-                <w:rFonts w:ascii="Tenorite Regular" w:eastAsia="Times New Roman" w:hAnsi="Tenorite Regular" w:cs="Times New Roman"/>
+                <w:rFonts w:eastAsia="Times New Roman" w:cs="Times New Roman"/>
                 <w:b/>
                 <w:bCs/>
                 <w:color w:val="000000"/>
@@ -580,7 +604,7 @@
             <w:pPr>
               <w:spacing w:after="0" w:line="240" w:lineRule="auto"/>
               <w:rPr>
-                <w:rFonts w:ascii="Tenorite Regular" w:eastAsia="Times New Roman" w:hAnsi="Tenorite Regular" w:cs="Times New Roman"/>
+                <w:rFonts w:eastAsia="Times New Roman" w:cs="Times New Roman"/>
                 <w:b/>
                 <w:bCs/>
                 <w:color w:val="000000"/>
@@ -593,7 +617,7 @@
             </w:pPr>
             <w:r>
               <w:rPr>
-                <w:rFonts w:ascii="Tenorite Regular" w:eastAsia="Times New Roman" w:hAnsi="Tenorite Regular" w:cs="Times New Roman"/>
+                <w:rFonts w:eastAsia="Times New Roman" w:cs="Times New Roman"/>
                 <w:b/>
                 <w:bCs/>
                 <w:color w:val="000000"/>
@@ -629,7 +653,7 @@
             <w:pPr>
               <w:spacing w:after="0" w:line="240" w:lineRule="auto"/>
               <w:rPr>
-                <w:rFonts w:ascii="Tenorite Regular" w:eastAsia="Times New Roman" w:hAnsi="Tenorite Regular" w:cs="Times New Roman"/>
+                <w:rFonts w:eastAsia="Times New Roman" w:cs="Times New Roman"/>
                 <w:color w:val="000000"/>
                 <w:kern w:val="0"/>
                 <w:sz w:val="20"/>
@@ -640,7 +664,7 @@
             </w:pPr>
             <w:r>
               <w:rPr>
-                <w:rFonts w:ascii="Tenorite Regular" w:eastAsia="Times New Roman" w:hAnsi="Tenorite Regular" w:cs="Times New Roman"/>
+                <w:rFonts w:eastAsia="Times New Roman" w:cs="Times New Roman"/>
                 <w:color w:val="000000"/>
                 <w:kern w:val="0"/>
                 <w:sz w:val="20"/>
@@ -669,7 +693,7 @@
             <w:pPr>
               <w:spacing w:after="0" w:line="240" w:lineRule="auto"/>
               <w:rPr>
-                <w:rFonts w:ascii="Tenorite Regular" w:eastAsia="Times New Roman" w:hAnsi="Tenorite Regular" w:cs="Times New Roman"/>
+                <w:rFonts w:eastAsia="Times New Roman" w:cs="Times New Roman"/>
                 <w:color w:val="000000"/>
                 <w:kern w:val="0"/>
                 <w:sz w:val="20"/>
@@ -680,7 +704,7 @@
             </w:pPr>
             <w:r>
               <w:rPr>
-                <w:rFonts w:ascii="Tenorite Regular" w:eastAsia="Times New Roman" w:hAnsi="Tenorite Regular" w:cs="Times New Roman"/>
+                <w:rFonts w:eastAsia="Times New Roman" w:cs="Times New Roman"/>
                 <w:color w:val="000000"/>
                 <w:kern w:val="0"/>
                 <w:sz w:val="20"/>
@@ -709,7 +733,7 @@
             <w:pPr>
               <w:spacing w:after="0" w:line="240" w:lineRule="auto"/>
               <w:rPr>
-                <w:rFonts w:ascii="Tenorite Regular" w:eastAsia="Times New Roman" w:hAnsi="Tenorite Regular" w:cs="Times New Roman"/>
+                <w:rFonts w:eastAsia="Times New Roman" w:cs="Times New Roman"/>
                 <w:color w:val="000000"/>
                 <w:kern w:val="0"/>
                 <w:sz w:val="20"/>
@@ -720,7 +744,7 @@
             </w:pPr>
             <w:r>
               <w:rPr>
-                <w:rFonts w:ascii="Tenorite Regular" w:eastAsia="Times New Roman" w:hAnsi="Tenorite Regular" w:cs="Times New Roman"/>
+                <w:rFonts w:eastAsia="Times New Roman" w:cs="Times New Roman"/>
                 <w:color w:val="000000"/>
                 <w:kern w:val="0"/>
                 <w:sz w:val="20"/>
@@ -749,7 +773,7 @@
             <w:pPr>
               <w:spacing w:after="0" w:line="240" w:lineRule="auto"/>
               <w:rPr>
-                <w:rFonts w:ascii="Tenorite Regular" w:eastAsia="Times New Roman" w:hAnsi="Tenorite Regular" w:cs="Times New Roman"/>
+                <w:rFonts w:eastAsia="Times New Roman" w:cs="Times New Roman"/>
                 <w:color w:val="000000"/>
                 <w:kern w:val="0"/>
                 <w:sz w:val="20"/>
@@ -760,7 +784,7 @@
             </w:pPr>
             <w:r>
               <w:rPr>
-                <w:rFonts w:ascii="Tenorite Regular" w:eastAsia="Times New Roman" w:hAnsi="Tenorite Regular" w:cs="Times New Roman"/>
+                <w:rFonts w:eastAsia="Times New Roman" w:cs="Times New Roman"/>
                 <w:color w:val="000000"/>
                 <w:kern w:val="0"/>
                 <w:sz w:val="20"/>
@@ -794,7 +818,7 @@
             <w:pPr>
               <w:spacing w:after="0" w:line="240" w:lineRule="auto"/>
               <w:rPr>
-                <w:rFonts w:ascii="Tenorite Regular" w:eastAsia="Times New Roman" w:hAnsi="Tenorite Regular" w:cs="Times New Roman"/>
+                <w:rFonts w:eastAsia="Times New Roman" w:cs="Times New Roman"/>
                 <w:color w:val="000000"/>
                 <w:kern w:val="0"/>
                 <w:sz w:val="20"/>
@@ -805,7 +829,7 @@
             </w:pPr>
             <w:r>
               <w:rPr>
-                <w:rFonts w:ascii="Tenorite Regular" w:eastAsia="Times New Roman" w:hAnsi="Tenorite Regular" w:cs="Times New Roman"/>
+                <w:rFonts w:eastAsia="Times New Roman" w:cs="Times New Roman"/>
                 <w:color w:val="000000"/>
                 <w:kern w:val="0"/>
                 <w:sz w:val="20"/>
@@ -834,7 +858,7 @@
             <w:pPr>
               <w:spacing w:after="0" w:line="240" w:lineRule="auto"/>
               <w:rPr>
-                <w:rFonts w:ascii="Tenorite Regular" w:eastAsia="Times New Roman" w:hAnsi="Tenorite Regular" w:cs="Times New Roman"/>
+                <w:rFonts w:eastAsia="Times New Roman" w:cs="Times New Roman"/>
                 <w:color w:val="000000"/>
                 <w:kern w:val="0"/>
                 <w:sz w:val="20"/>
@@ -845,7 +869,7 @@
             </w:pPr>
             <w:r>
               <w:rPr>
-                <w:rFonts w:ascii="Tenorite Regular" w:eastAsia="Times New Roman" w:hAnsi="Tenorite Regular" w:cs="Times New Roman"/>
+                <w:rFonts w:eastAsia="Times New Roman" w:cs="Times New Roman"/>
                 <w:color w:val="000000"/>
                 <w:kern w:val="0"/>
                 <w:sz w:val="20"/>
@@ -874,7 +898,7 @@
             <w:pPr>
               <w:spacing w:after="0" w:line="240" w:lineRule="auto"/>
               <w:rPr>
-                <w:rFonts w:ascii="Tenorite Regular" w:eastAsia="Times New Roman" w:hAnsi="Tenorite Regular" w:cs="Times New Roman"/>
+                <w:rFonts w:eastAsia="Times New Roman" w:cs="Times New Roman"/>
                 <w:color w:val="000000"/>
                 <w:kern w:val="0"/>
                 <w:sz w:val="20"/>
@@ -885,7 +909,7 @@
             </w:pPr>
             <w:r>
               <w:rPr>
-                <w:rFonts w:ascii="Tenorite Regular" w:eastAsia="Times New Roman" w:hAnsi="Tenorite Regular" w:cs="Times New Roman"/>
+                <w:rFonts w:eastAsia="Times New Roman" w:cs="Times New Roman"/>
                 <w:color w:val="000000"/>
                 <w:kern w:val="0"/>
                 <w:sz w:val="20"/>
@@ -914,7 +938,7 @@
             <w:pPr>
               <w:spacing w:after="0" w:line="240" w:lineRule="auto"/>
               <w:rPr>
-                <w:rFonts w:ascii="Tenorite Regular" w:eastAsia="Times New Roman" w:hAnsi="Tenorite Regular" w:cs="Times New Roman"/>
+                <w:rFonts w:eastAsia="Times New Roman" w:cs="Times New Roman"/>
                 <w:color w:val="000000"/>
                 <w:kern w:val="0"/>
                 <w:sz w:val="20"/>
@@ -925,7 +949,7 @@
             </w:pPr>
             <w:r>
               <w:rPr>
-                <w:rFonts w:ascii="Tenorite Regular" w:eastAsia="Times New Roman" w:hAnsi="Tenorite Regular" w:cs="Times New Roman"/>
+                <w:rFonts w:eastAsia="Times New Roman" w:cs="Times New Roman"/>
                 <w:color w:val="000000"/>
                 <w:kern w:val="0"/>
                 <w:sz w:val="20"/>
@@ -959,7 +983,7 @@
             <w:pPr>
               <w:spacing w:after="0" w:line="240" w:lineRule="auto"/>
               <w:rPr>
-                <w:rFonts w:ascii="Tenorite Regular" w:eastAsia="Times New Roman" w:hAnsi="Tenorite Regular" w:cs="Times New Roman"/>
+                <w:rFonts w:eastAsia="Times New Roman" w:cs="Times New Roman"/>
                 <w:color w:val="000000"/>
                 <w:kern w:val="0"/>
                 <w:sz w:val="20"/>
@@ -970,7 +994,7 @@
             </w:pPr>
             <w:r>
               <w:rPr>
-                <w:rFonts w:ascii="Tenorite Regular" w:eastAsia="Times New Roman" w:hAnsi="Tenorite Regular" w:cs="Times New Roman"/>
+                <w:rFonts w:eastAsia="Times New Roman" w:cs="Times New Roman"/>
                 <w:color w:val="000000"/>
                 <w:kern w:val="0"/>
                 <w:sz w:val="20"/>
@@ -999,7 +1023,7 @@
             <w:pPr>
               <w:spacing w:after="0" w:line="240" w:lineRule="auto"/>
               <w:rPr>
-                <w:rFonts w:ascii="Tenorite Regular" w:eastAsia="Times New Roman" w:hAnsi="Tenorite Regular" w:cs="Times New Roman"/>
+                <w:rFonts w:eastAsia="Times New Roman" w:cs="Times New Roman"/>
                 <w:color w:val="000000"/>
                 <w:kern w:val="0"/>
                 <w:sz w:val="20"/>
@@ -1010,7 +1034,7 @@
             </w:pPr>
             <w:r>
               <w:rPr>
-                <w:rFonts w:ascii="Tenorite Regular" w:eastAsia="Times New Roman" w:hAnsi="Tenorite Regular" w:cs="Times New Roman"/>
+                <w:rFonts w:eastAsia="Times New Roman" w:cs="Times New Roman"/>
                 <w:color w:val="000000"/>
                 <w:kern w:val="0"/>
                 <w:sz w:val="20"/>
@@ -1039,7 +1063,7 @@
             <w:pPr>
               <w:spacing w:after="0" w:line="240" w:lineRule="auto"/>
               <w:rPr>
-                <w:rFonts w:ascii="Tenorite Regular" w:eastAsia="Times New Roman" w:hAnsi="Tenorite Regular" w:cs="Times New Roman"/>
+                <w:rFonts w:eastAsia="Times New Roman" w:cs="Times New Roman"/>
                 <w:color w:val="000000"/>
                 <w:kern w:val="0"/>
                 <w:sz w:val="20"/>
@@ -1050,7 +1074,7 @@
             </w:pPr>
             <w:r>
               <w:rPr>
-                <w:rFonts w:ascii="Tenorite Regular" w:eastAsia="Times New Roman" w:hAnsi="Tenorite Regular" w:cs="Times New Roman"/>
+                <w:rFonts w:eastAsia="Times New Roman" w:cs="Times New Roman"/>
                 <w:color w:val="000000"/>
                 <w:kern w:val="0"/>
                 <w:sz w:val="20"/>
@@ -1079,7 +1103,7 @@
             <w:pPr>
               <w:spacing w:after="0" w:line="240" w:lineRule="auto"/>
               <w:rPr>
-                <w:rFonts w:ascii="Tenorite Regular" w:eastAsia="Times New Roman" w:hAnsi="Tenorite Regular" w:cs="Times New Roman"/>
+                <w:rFonts w:eastAsia="Times New Roman" w:cs="Times New Roman"/>
                 <w:color w:val="000000"/>
                 <w:kern w:val="0"/>
                 <w:sz w:val="20"/>
@@ -1090,7 +1114,7 @@
             </w:pPr>
             <w:r>
               <w:rPr>
-                <w:rFonts w:ascii="Tenorite Regular" w:eastAsia="Times New Roman" w:hAnsi="Tenorite Regular" w:cs="Times New Roman"/>
+                <w:rFonts w:eastAsia="Times New Roman" w:cs="Times New Roman"/>
                 <w:color w:val="000000"/>
                 <w:kern w:val="0"/>
                 <w:sz w:val="20"/>
@@ -1124,7 +1148,7 @@
             <w:pPr>
               <w:spacing w:after="0" w:line="240" w:lineRule="auto"/>
               <w:rPr>
-                <w:rFonts w:ascii="Tenorite Regular" w:eastAsia="Times New Roman" w:hAnsi="Tenorite Regular" w:cs="Times New Roman"/>
+                <w:rFonts w:eastAsia="Times New Roman" w:cs="Times New Roman"/>
                 <w:color w:val="000000"/>
                 <w:kern w:val="0"/>
                 <w:sz w:val="20"/>
@@ -1135,7 +1159,7 @@
             </w:pPr>
             <w:r>
               <w:rPr>
-                <w:rFonts w:ascii="Tenorite Regular" w:eastAsia="Times New Roman" w:hAnsi="Tenorite Regular" w:cs="Times New Roman"/>
+                <w:rFonts w:eastAsia="Times New Roman" w:cs="Times New Roman"/>
                 <w:color w:val="000000"/>
                 <w:kern w:val="0"/>
                 <w:sz w:val="20"/>
@@ -1164,7 +1188,7 @@
             <w:pPr>
               <w:spacing w:after="0" w:line="240" w:lineRule="auto"/>
               <w:rPr>
-                <w:rFonts w:ascii="Tenorite Regular" w:eastAsia="Times New Roman" w:hAnsi="Tenorite Regular" w:cs="Times New Roman"/>
+                <w:rFonts w:eastAsia="Times New Roman" w:cs="Times New Roman"/>
                 <w:color w:val="000000"/>
                 <w:kern w:val="0"/>
                 <w:sz w:val="20"/>
@@ -1175,7 +1199,7 @@
             </w:pPr>
             <w:r>
               <w:rPr>
-                <w:rFonts w:ascii="Tenorite Regular" w:eastAsia="Times New Roman" w:hAnsi="Tenorite Regular" w:cs="Times New Roman"/>
+                <w:rFonts w:eastAsia="Times New Roman" w:cs="Times New Roman"/>
                 <w:color w:val="000000"/>
                 <w:kern w:val="0"/>
                 <w:sz w:val="20"/>
@@ -1204,7 +1228,7 @@
             <w:pPr>
               <w:spacing w:after="0" w:line="240" w:lineRule="auto"/>
               <w:rPr>
-                <w:rFonts w:ascii="Tenorite Regular" w:eastAsia="Times New Roman" w:hAnsi="Tenorite Regular" w:cs="Times New Roman"/>
+                <w:rFonts w:eastAsia="Times New Roman" w:cs="Times New Roman"/>
                 <w:color w:val="000000"/>
                 <w:kern w:val="0"/>
                 <w:sz w:val="20"/>
@@ -1215,7 +1239,7 @@
             </w:pPr>
             <w:r>
               <w:rPr>
-                <w:rFonts w:ascii="Tenorite Regular" w:eastAsia="Times New Roman" w:hAnsi="Tenorite Regular" w:cs="Times New Roman"/>
+                <w:rFonts w:eastAsia="Times New Roman" w:cs="Times New Roman"/>
                 <w:color w:val="000000"/>
                 <w:kern w:val="0"/>
                 <w:sz w:val="20"/>
@@ -1244,7 +1268,7 @@
             <w:pPr>
               <w:spacing w:after="0" w:line="240" w:lineRule="auto"/>
               <w:rPr>
-                <w:rFonts w:ascii="Tenorite Regular" w:eastAsia="Times New Roman" w:hAnsi="Tenorite Regular" w:cs="Times New Roman"/>
+                <w:rFonts w:eastAsia="Times New Roman" w:cs="Times New Roman"/>
                 <w:color w:val="000000"/>
                 <w:kern w:val="0"/>
                 <w:sz w:val="20"/>
@@ -1255,7 +1279,7 @@
             </w:pPr>
             <w:r>
               <w:rPr>
-                <w:rFonts w:ascii="Tenorite Regular" w:eastAsia="Times New Roman" w:hAnsi="Tenorite Regular" w:cs="Times New Roman"/>
+                <w:rFonts w:eastAsia="Times New Roman" w:cs="Times New Roman"/>
                 <w:color w:val="000000"/>
                 <w:kern w:val="0"/>
                 <w:sz w:val="20"/>
@@ -1289,7 +1313,7 @@
             <w:pPr>
               <w:spacing w:after="0" w:line="240" w:lineRule="auto"/>
               <w:rPr>
-                <w:rFonts w:ascii="Tenorite Regular" w:eastAsia="Times New Roman" w:hAnsi="Tenorite Regular" w:cs="Times New Roman"/>
+                <w:rFonts w:eastAsia="Times New Roman" w:cs="Times New Roman"/>
                 <w:color w:val="000000"/>
                 <w:kern w:val="0"/>
                 <w:sz w:val="20"/>
@@ -1300,7 +1324,7 @@
             </w:pPr>
             <w:r>
               <w:rPr>
-                <w:rFonts w:ascii="Tenorite Regular" w:eastAsia="Times New Roman" w:hAnsi="Tenorite Regular" w:cs="Times New Roman"/>
+                <w:rFonts w:eastAsia="Times New Roman" w:cs="Times New Roman"/>
                 <w:color w:val="000000"/>
                 <w:kern w:val="0"/>
                 <w:sz w:val="20"/>
@@ -1329,7 +1353,7 @@
             <w:pPr>
               <w:spacing w:after="0" w:line="240" w:lineRule="auto"/>
               <w:rPr>
-                <w:rFonts w:ascii="Tenorite Regular" w:eastAsia="Times New Roman" w:hAnsi="Tenorite Regular" w:cs="Times New Roman"/>
+                <w:rFonts w:eastAsia="Times New Roman" w:cs="Times New Roman"/>
                 <w:color w:val="000000"/>
                 <w:kern w:val="0"/>
                 <w:sz w:val="20"/>
@@ -1340,7 +1364,7 @@
             </w:pPr>
             <w:r>
               <w:rPr>
-                <w:rFonts w:ascii="Tenorite Regular" w:eastAsia="Times New Roman" w:hAnsi="Tenorite Regular" w:cs="Times New Roman"/>
+                <w:rFonts w:eastAsia="Times New Roman" w:cs="Times New Roman"/>
                 <w:color w:val="000000"/>
                 <w:kern w:val="0"/>
                 <w:sz w:val="20"/>
@@ -1369,7 +1393,7 @@
             <w:pPr>
               <w:spacing w:after="0" w:line="240" w:lineRule="auto"/>
               <w:rPr>
-                <w:rFonts w:ascii="Tenorite Regular" w:eastAsia="Times New Roman" w:hAnsi="Tenorite Regular" w:cs="Times New Roman"/>
+                <w:rFonts w:eastAsia="Times New Roman" w:cs="Times New Roman"/>
                 <w:color w:val="000000"/>
                 <w:kern w:val="0"/>
                 <w:sz w:val="20"/>
@@ -1380,7 +1404,7 @@
             </w:pPr>
             <w:r>
               <w:rPr>
-                <w:rFonts w:ascii="Tenorite Regular" w:eastAsia="Times New Roman" w:hAnsi="Tenorite Regular" w:cs="Times New Roman"/>
+                <w:rFonts w:eastAsia="Times New Roman" w:cs="Times New Roman"/>
                 <w:color w:val="000000"/>
                 <w:kern w:val="0"/>
                 <w:sz w:val="20"/>
@@ -1409,7 +1433,7 @@
             <w:pPr>
               <w:spacing w:after="0" w:line="240" w:lineRule="auto"/>
               <w:rPr>
-                <w:rFonts w:ascii="Tenorite Regular" w:eastAsia="Times New Roman" w:hAnsi="Tenorite Regular" w:cs="Times New Roman"/>
+                <w:rFonts w:eastAsia="Times New Roman" w:cs="Times New Roman"/>
                 <w:color w:val="000000"/>
                 <w:kern w:val="0"/>
                 <w:sz w:val="20"/>
@@ -1420,7 +1444,7 @@
             </w:pPr>
             <w:r>
               <w:rPr>
-                <w:rFonts w:ascii="Tenorite Regular" w:eastAsia="Times New Roman" w:hAnsi="Tenorite Regular" w:cs="Times New Roman"/>
+                <w:rFonts w:eastAsia="Times New Roman" w:cs="Times New Roman"/>
                 <w:color w:val="000000"/>
                 <w:kern w:val="0"/>
                 <w:sz w:val="20"/>
@@ -1454,7 +1478,7 @@
             <w:pPr>
               <w:spacing w:after="0" w:line="240" w:lineRule="auto"/>
               <w:rPr>
-                <w:rFonts w:ascii="Tenorite Regular" w:eastAsia="Times New Roman" w:hAnsi="Tenorite Regular" w:cs="Times New Roman"/>
+                <w:rFonts w:eastAsia="Times New Roman" w:cs="Times New Roman"/>
                 <w:color w:val="000000"/>
                 <w:kern w:val="0"/>
                 <w:sz w:val="20"/>
@@ -1465,7 +1489,7 @@
             </w:pPr>
             <w:r>
               <w:rPr>
-                <w:rFonts w:ascii="Tenorite Regular" w:eastAsia="Times New Roman" w:hAnsi="Tenorite Regular" w:cs="Times New Roman"/>
+                <w:rFonts w:eastAsia="Times New Roman" w:cs="Times New Roman"/>
                 <w:color w:val="000000"/>
                 <w:kern w:val="0"/>
                 <w:sz w:val="20"/>
@@ -1494,7 +1518,7 @@
             <w:pPr>
               <w:spacing w:after="0" w:line="240" w:lineRule="auto"/>
               <w:rPr>
-                <w:rFonts w:ascii="Tenorite Regular" w:eastAsia="Times New Roman" w:hAnsi="Tenorite Regular" w:cs="Times New Roman"/>
+                <w:rFonts w:eastAsia="Times New Roman" w:cs="Times New Roman"/>
                 <w:color w:val="000000"/>
                 <w:kern w:val="0"/>
                 <w:sz w:val="20"/>
@@ -1505,7 +1529,7 @@
             </w:pPr>
             <w:r>
               <w:rPr>
-                <w:rFonts w:ascii="Tenorite Regular" w:eastAsia="Times New Roman" w:hAnsi="Tenorite Regular" w:cs="Times New Roman"/>
+                <w:rFonts w:eastAsia="Times New Roman" w:cs="Times New Roman"/>
                 <w:color w:val="000000"/>
                 <w:kern w:val="0"/>
                 <w:sz w:val="20"/>
@@ -1534,7 +1558,7 @@
             <w:pPr>
               <w:spacing w:after="0" w:line="240" w:lineRule="auto"/>
               <w:rPr>
-                <w:rFonts w:ascii="Tenorite Regular" w:eastAsia="Times New Roman" w:hAnsi="Tenorite Regular" w:cs="Times New Roman"/>
+                <w:rFonts w:eastAsia="Times New Roman" w:cs="Times New Roman"/>
                 <w:color w:val="000000"/>
                 <w:kern w:val="0"/>
                 <w:sz w:val="20"/>
@@ -1545,7 +1569,7 @@
             </w:pPr>
             <w:r>
               <w:rPr>
-                <w:rFonts w:ascii="Tenorite Regular" w:eastAsia="Times New Roman" w:hAnsi="Tenorite Regular" w:cs="Times New Roman"/>
+                <w:rFonts w:eastAsia="Times New Roman" w:cs="Times New Roman"/>
                 <w:color w:val="000000"/>
                 <w:kern w:val="0"/>
                 <w:sz w:val="20"/>
@@ -1574,7 +1598,7 @@
             <w:pPr>
               <w:spacing w:after="0" w:line="240" w:lineRule="auto"/>
               <w:rPr>
-                <w:rFonts w:ascii="Tenorite Regular" w:eastAsia="Times New Roman" w:hAnsi="Tenorite Regular" w:cs="Times New Roman"/>
+                <w:rFonts w:eastAsia="Times New Roman" w:cs="Times New Roman"/>
                 <w:color w:val="000000"/>
                 <w:kern w:val="0"/>
                 <w:sz w:val="20"/>
@@ -1585,7 +1609,7 @@
             </w:pPr>
             <w:r>
               <w:rPr>
-                <w:rFonts w:ascii="Tenorite Regular" w:eastAsia="Times New Roman" w:hAnsi="Tenorite Regular" w:cs="Times New Roman"/>
+                <w:rFonts w:eastAsia="Times New Roman" w:cs="Times New Roman"/>
                 <w:color w:val="000000"/>
                 <w:kern w:val="0"/>
                 <w:sz w:val="20"/>
@@ -1619,7 +1643,7 @@
             <w:pPr>
               <w:spacing w:after="0" w:line="240" w:lineRule="auto"/>
               <w:rPr>
-                <w:rFonts w:ascii="Tenorite Regular" w:eastAsia="Times New Roman" w:hAnsi="Tenorite Regular" w:cs="Times New Roman"/>
+                <w:rFonts w:eastAsia="Times New Roman" w:cs="Times New Roman"/>
                 <w:color w:val="000000"/>
                 <w:kern w:val="0"/>
                 <w:sz w:val="20"/>
@@ -1630,7 +1654,7 @@
             </w:pPr>
             <w:r>
               <w:rPr>
-                <w:rFonts w:ascii="Tenorite Regular" w:eastAsia="Times New Roman" w:hAnsi="Tenorite Regular" w:cs="Times New Roman"/>
+                <w:rFonts w:eastAsia="Times New Roman" w:cs="Times New Roman"/>
                 <w:color w:val="000000"/>
                 <w:kern w:val="0"/>
                 <w:sz w:val="20"/>
@@ -1659,7 +1683,7 @@
             <w:pPr>
               <w:spacing w:after="0" w:line="240" w:lineRule="auto"/>
               <w:rPr>
-                <w:rFonts w:ascii="Tenorite Regular" w:eastAsia="Times New Roman" w:hAnsi="Tenorite Regular" w:cs="Times New Roman"/>
+                <w:rFonts w:eastAsia="Times New Roman" w:cs="Times New Roman"/>
                 <w:color w:val="000000"/>
                 <w:kern w:val="0"/>
                 <w:sz w:val="20"/>
@@ -1670,7 +1694,7 @@
             </w:pPr>
             <w:r>
               <w:rPr>
-                <w:rFonts w:ascii="Tenorite Regular" w:eastAsia="Times New Roman" w:hAnsi="Tenorite Regular" w:cs="Times New Roman"/>
+                <w:rFonts w:eastAsia="Times New Roman" w:cs="Times New Roman"/>
                 <w:color w:val="000000"/>
                 <w:kern w:val="0"/>
                 <w:sz w:val="20"/>
@@ -1699,7 +1723,7 @@
             <w:pPr>
               <w:spacing w:after="0" w:line="240" w:lineRule="auto"/>
               <w:rPr>
-                <w:rFonts w:ascii="Tenorite Regular" w:eastAsia="Times New Roman" w:hAnsi="Tenorite Regular" w:cs="Times New Roman"/>
+                <w:rFonts w:eastAsia="Times New Roman" w:cs="Times New Roman"/>
                 <w:color w:val="000000"/>
                 <w:kern w:val="0"/>
                 <w:sz w:val="20"/>
@@ -1710,7 +1734,7 @@
             </w:pPr>
             <w:r>
               <w:rPr>
-                <w:rFonts w:ascii="Tenorite Regular" w:eastAsia="Times New Roman" w:hAnsi="Tenorite Regular" w:cs="Times New Roman"/>
+                <w:rFonts w:eastAsia="Times New Roman" w:cs="Times New Roman"/>
                 <w:color w:val="000000"/>
                 <w:kern w:val="0"/>
                 <w:sz w:val="20"/>
@@ -1739,7 +1763,7 @@
             <w:pPr>
               <w:spacing w:after="0" w:line="240" w:lineRule="auto"/>
               <w:rPr>
-                <w:rFonts w:ascii="Tenorite Regular" w:eastAsia="Times New Roman" w:hAnsi="Tenorite Regular" w:cs="Times New Roman"/>
+                <w:rFonts w:eastAsia="Times New Roman" w:cs="Times New Roman"/>
                 <w:color w:val="000000"/>
                 <w:kern w:val="0"/>
                 <w:sz w:val="20"/>
@@ -1750,7 +1774,7 @@
             </w:pPr>
             <w:r>
               <w:rPr>
-                <w:rFonts w:ascii="Tenorite Regular" w:eastAsia="Times New Roman" w:hAnsi="Tenorite Regular" w:cs="Times New Roman"/>
+                <w:rFonts w:eastAsia="Times New Roman" w:cs="Times New Roman"/>
                 <w:color w:val="000000"/>
                 <w:kern w:val="0"/>
                 <w:sz w:val="20"/>
@@ -1767,46 +1791,78 @@
     <w:p>
       <w:pPr>
         <w:spacing w:after="0"/>
+        <w:rPr>
+          <w:sz w:val="20"/>
+          <w:szCs w:val="20"/>
+        </w:rPr>
       </w:pPr>
     </w:p>
     <w:p>
       <w:pPr>
         <w:spacing w:after="0"/>
+        <w:rPr>
+          <w:sz w:val="20"/>
+          <w:szCs w:val="20"/>
+        </w:rPr>
       </w:pPr>
       <w:r>
         <w:rPr>
           <w:b/>
           <w:bCs/>
+          <w:sz w:val="20"/>
+          <w:szCs w:val="20"/>
         </w:rPr>
         <w:t>Back-office agents</w:t>
       </w:r>
       <w:r>
+        <w:rPr>
+          <w:sz w:val="20"/>
+          <w:szCs w:val="20"/>
+        </w:rPr>
         <w:t xml:space="preserve"> have no physical queue. A customer never walks up to a back-office desk. The only inbound reference a back-office agent receives is what the telephony/CTI system pushes to their screen when a call is routed to them — that's the CTI reference. No queue number, no ticket number.</w:t>
       </w:r>
     </w:p>
     <w:p>
       <w:pPr>
         <w:spacing w:after="0"/>
+        <w:rPr>
+          <w:sz w:val="20"/>
+          <w:szCs w:val="20"/>
+        </w:rPr>
       </w:pPr>
     </w:p>
     <w:p>
       <w:pPr>
         <w:spacing w:after="0"/>
+        <w:rPr>
+          <w:sz w:val="20"/>
+          <w:szCs w:val="20"/>
+        </w:rPr>
       </w:pPr>
       <w:r>
         <w:rPr>
           <w:b/>
           <w:bCs/>
+          <w:sz w:val="20"/>
+          <w:szCs w:val="20"/>
         </w:rPr>
         <w:t>Retail agents</w:t>
       </w:r>
       <w:r>
+        <w:rPr>
+          <w:sz w:val="20"/>
+          <w:szCs w:val="20"/>
+        </w:rPr>
         <w:t xml:space="preserve"> have no CTI system. They're face-to-face. The customer checks in at a kiosk or counter, the queue system issues a ticket (e.g. QT-000042), and that ticket number is what the agent enters to link the activation to the queued visit.</w:t>
       </w:r>
     </w:p>
     <w:p>
       <w:pPr>
         <w:spacing w:after="0"/>
+        <w:rPr>
+          <w:sz w:val="20"/>
+          <w:szCs w:val="20"/>
+        </w:rPr>
       </w:pPr>
     </w:p>
     <w:tbl>
@@ -1844,22 +1900,26 @@
             <w:pPr>
               <w:spacing w:after="0" w:line="240" w:lineRule="auto"/>
               <w:rPr>
-                <w:rFonts w:ascii="Aptos Narrow" w:eastAsia="Times New Roman" w:hAnsi="Aptos Narrow" w:cs="Times New Roman"/>
+                <w:rFonts w:eastAsia="Times New Roman" w:cs="Times New Roman"/>
                 <w:b/>
                 <w:bCs/>
                 <w:color w:val="000000"/>
                 <w:kern w:val="0"/>
+                <w:sz w:val="20"/>
+                <w:szCs w:val="20"/>
                 <w:lang w:eastAsia="en-GB"/>
                 <w14:ligatures w14:val="none"/>
               </w:rPr>
             </w:pPr>
             <w:r>
               <w:rPr>
-                <w:rFonts w:ascii="Aptos Narrow" w:eastAsia="Times New Roman" w:hAnsi="Aptos Narrow" w:cs="Times New Roman"/>
+                <w:rFonts w:eastAsia="Times New Roman" w:cs="Times New Roman"/>
                 <w:b/>
                 <w:bCs/>
                 <w:color w:val="000000"/>
                 <w:kern w:val="0"/>
+                <w:sz w:val="20"/>
+                <w:szCs w:val="20"/>
                 <w:lang w:eastAsia="en-GB"/>
                 <w14:ligatures w14:val="none"/>
               </w:rPr>
@@ -1884,22 +1944,26 @@
             <w:pPr>
               <w:spacing w:after="0" w:line="240" w:lineRule="auto"/>
               <w:rPr>
-                <w:rFonts w:ascii="Aptos Narrow" w:eastAsia="Times New Roman" w:hAnsi="Aptos Narrow" w:cs="Times New Roman"/>
+                <w:rFonts w:eastAsia="Times New Roman" w:cs="Times New Roman"/>
                 <w:b/>
                 <w:bCs/>
                 <w:color w:val="000000"/>
                 <w:kern w:val="0"/>
+                <w:sz w:val="20"/>
+                <w:szCs w:val="20"/>
                 <w:lang w:eastAsia="en-GB"/>
                 <w14:ligatures w14:val="none"/>
               </w:rPr>
             </w:pPr>
             <w:r>
               <w:rPr>
-                <w:rFonts w:ascii="Aptos Narrow" w:eastAsia="Times New Roman" w:hAnsi="Aptos Narrow" w:cs="Times New Roman"/>
+                <w:rFonts w:eastAsia="Times New Roman" w:cs="Times New Roman"/>
                 <w:b/>
                 <w:bCs/>
                 <w:color w:val="000000"/>
                 <w:kern w:val="0"/>
+                <w:sz w:val="20"/>
+                <w:szCs w:val="20"/>
                 <w:lang w:eastAsia="en-GB"/>
                 <w14:ligatures w14:val="none"/>
               </w:rPr>
@@ -1924,22 +1988,26 @@
             <w:pPr>
               <w:spacing w:after="0" w:line="240" w:lineRule="auto"/>
               <w:rPr>
-                <w:rFonts w:ascii="Aptos Narrow" w:eastAsia="Times New Roman" w:hAnsi="Aptos Narrow" w:cs="Times New Roman"/>
+                <w:rFonts w:eastAsia="Times New Roman" w:cs="Times New Roman"/>
                 <w:b/>
                 <w:bCs/>
                 <w:color w:val="000000"/>
                 <w:kern w:val="0"/>
+                <w:sz w:val="20"/>
+                <w:szCs w:val="20"/>
                 <w:lang w:eastAsia="en-GB"/>
                 <w14:ligatures w14:val="none"/>
               </w:rPr>
             </w:pPr>
             <w:r>
               <w:rPr>
-                <w:rFonts w:ascii="Aptos Narrow" w:eastAsia="Times New Roman" w:hAnsi="Aptos Narrow" w:cs="Times New Roman"/>
+                <w:rFonts w:eastAsia="Times New Roman" w:cs="Times New Roman"/>
                 <w:b/>
                 <w:bCs/>
                 <w:color w:val="000000"/>
                 <w:kern w:val="0"/>
+                <w:sz w:val="20"/>
+                <w:szCs w:val="20"/>
                 <w:lang w:eastAsia="en-GB"/>
                 <w14:ligatures w14:val="none"/>
               </w:rPr>
@@ -1969,18 +2037,22 @@
             <w:pPr>
               <w:spacing w:after="0" w:line="240" w:lineRule="auto"/>
               <w:rPr>
-                <w:rFonts w:ascii="Aptos Narrow" w:eastAsia="Times New Roman" w:hAnsi="Aptos Narrow" w:cs="Times New Roman"/>
-                <w:color w:val="000000"/>
-                <w:kern w:val="0"/>
+                <w:rFonts w:eastAsia="Times New Roman" w:cs="Times New Roman"/>
+                <w:color w:val="000000"/>
+                <w:kern w:val="0"/>
+                <w:sz w:val="20"/>
+                <w:szCs w:val="20"/>
                 <w:lang w:eastAsia="en-GB"/>
                 <w14:ligatures w14:val="none"/>
               </w:rPr>
             </w:pPr>
             <w:r>
               <w:rPr>
-                <w:rFonts w:ascii="Aptos Narrow" w:eastAsia="Times New Roman" w:hAnsi="Aptos Narrow" w:cs="Times New Roman"/>
-                <w:color w:val="000000"/>
-                <w:kern w:val="0"/>
+                <w:rFonts w:eastAsia="Times New Roman" w:cs="Times New Roman"/>
+                <w:color w:val="000000"/>
+                <w:kern w:val="0"/>
+                <w:sz w:val="20"/>
+                <w:szCs w:val="20"/>
                 <w:lang w:eastAsia="en-GB"/>
                 <w14:ligatures w14:val="none"/>
               </w:rPr>
@@ -2005,18 +2077,22 @@
             <w:pPr>
               <w:spacing w:after="0" w:line="240" w:lineRule="auto"/>
               <w:rPr>
-                <w:rFonts w:ascii="Aptos Narrow" w:eastAsia="Times New Roman" w:hAnsi="Aptos Narrow" w:cs="Times New Roman"/>
-                <w:color w:val="000000"/>
-                <w:kern w:val="0"/>
+                <w:rFonts w:eastAsia="Times New Roman" w:cs="Times New Roman"/>
+                <w:color w:val="000000"/>
+                <w:kern w:val="0"/>
+                <w:sz w:val="20"/>
+                <w:szCs w:val="20"/>
                 <w:lang w:eastAsia="en-GB"/>
                 <w14:ligatures w14:val="none"/>
               </w:rPr>
             </w:pPr>
             <w:r>
               <w:rPr>
-                <w:rFonts w:ascii="Aptos Narrow" w:eastAsia="Times New Roman" w:hAnsi="Aptos Narrow" w:cs="Times New Roman"/>
-                <w:color w:val="000000"/>
-                <w:kern w:val="0"/>
+                <w:rFonts w:eastAsia="Times New Roman" w:cs="Times New Roman"/>
+                <w:color w:val="000000"/>
+                <w:kern w:val="0"/>
+                <w:sz w:val="20"/>
+                <w:szCs w:val="20"/>
                 <w:lang w:eastAsia="en-GB"/>
                 <w14:ligatures w14:val="none"/>
               </w:rPr>
@@ -2041,18 +2117,22 @@
             <w:pPr>
               <w:spacing w:after="0" w:line="240" w:lineRule="auto"/>
               <w:rPr>
-                <w:rFonts w:ascii="Aptos Narrow" w:eastAsia="Times New Roman" w:hAnsi="Aptos Narrow" w:cs="Times New Roman"/>
-                <w:color w:val="000000"/>
-                <w:kern w:val="0"/>
+                <w:rFonts w:eastAsia="Times New Roman" w:cs="Times New Roman"/>
+                <w:color w:val="000000"/>
+                <w:kern w:val="0"/>
+                <w:sz w:val="20"/>
+                <w:szCs w:val="20"/>
                 <w:lang w:eastAsia="en-GB"/>
                 <w14:ligatures w14:val="none"/>
               </w:rPr>
             </w:pPr>
             <w:r>
               <w:rPr>
-                <w:rFonts w:ascii="Aptos Narrow" w:eastAsia="Times New Roman" w:hAnsi="Aptos Narrow" w:cs="Times New Roman"/>
-                <w:color w:val="000000"/>
-                <w:kern w:val="0"/>
+                <w:rFonts w:eastAsia="Times New Roman" w:cs="Times New Roman"/>
+                <w:color w:val="000000"/>
+                <w:kern w:val="0"/>
+                <w:sz w:val="20"/>
+                <w:szCs w:val="20"/>
                 <w:lang w:eastAsia="en-GB"/>
                 <w14:ligatures w14:val="none"/>
               </w:rPr>
@@ -2082,18 +2162,22 @@
             <w:pPr>
               <w:spacing w:after="0" w:line="240" w:lineRule="auto"/>
               <w:rPr>
-                <w:rFonts w:ascii="Aptos Narrow" w:eastAsia="Times New Roman" w:hAnsi="Aptos Narrow" w:cs="Times New Roman"/>
-                <w:color w:val="000000"/>
-                <w:kern w:val="0"/>
+                <w:rFonts w:eastAsia="Times New Roman" w:cs="Times New Roman"/>
+                <w:color w:val="000000"/>
+                <w:kern w:val="0"/>
+                <w:sz w:val="20"/>
+                <w:szCs w:val="20"/>
                 <w:lang w:eastAsia="en-GB"/>
                 <w14:ligatures w14:val="none"/>
               </w:rPr>
             </w:pPr>
             <w:r>
               <w:rPr>
-                <w:rFonts w:ascii="Aptos Narrow" w:eastAsia="Times New Roman" w:hAnsi="Aptos Narrow" w:cs="Times New Roman"/>
-                <w:color w:val="000000"/>
-                <w:kern w:val="0"/>
+                <w:rFonts w:eastAsia="Times New Roman" w:cs="Times New Roman"/>
+                <w:color w:val="000000"/>
+                <w:kern w:val="0"/>
+                <w:sz w:val="20"/>
+                <w:szCs w:val="20"/>
                 <w:lang w:eastAsia="en-GB"/>
                 <w14:ligatures w14:val="none"/>
               </w:rPr>
@@ -2118,18 +2202,22 @@
             <w:pPr>
               <w:spacing w:after="0" w:line="240" w:lineRule="auto"/>
               <w:rPr>
-                <w:rFonts w:ascii="Aptos Narrow" w:eastAsia="Times New Roman" w:hAnsi="Aptos Narrow" w:cs="Times New Roman"/>
-                <w:color w:val="000000"/>
-                <w:kern w:val="0"/>
+                <w:rFonts w:eastAsia="Times New Roman" w:cs="Times New Roman"/>
+                <w:color w:val="000000"/>
+                <w:kern w:val="0"/>
+                <w:sz w:val="20"/>
+                <w:szCs w:val="20"/>
                 <w:lang w:eastAsia="en-GB"/>
                 <w14:ligatures w14:val="none"/>
               </w:rPr>
             </w:pPr>
             <w:r>
               <w:rPr>
-                <w:rFonts w:ascii="Aptos Narrow" w:eastAsia="Times New Roman" w:hAnsi="Aptos Narrow" w:cs="Times New Roman"/>
-                <w:color w:val="000000"/>
-                <w:kern w:val="0"/>
+                <w:rFonts w:eastAsia="Times New Roman" w:cs="Times New Roman"/>
+                <w:color w:val="000000"/>
+                <w:kern w:val="0"/>
+                <w:sz w:val="20"/>
+                <w:szCs w:val="20"/>
                 <w:lang w:eastAsia="en-GB"/>
                 <w14:ligatures w14:val="none"/>
               </w:rPr>
@@ -2154,18 +2242,22 @@
             <w:pPr>
               <w:spacing w:after="0" w:line="240" w:lineRule="auto"/>
               <w:rPr>
-                <w:rFonts w:ascii="Aptos Narrow" w:eastAsia="Times New Roman" w:hAnsi="Aptos Narrow" w:cs="Times New Roman"/>
-                <w:color w:val="000000"/>
-                <w:kern w:val="0"/>
+                <w:rFonts w:eastAsia="Times New Roman" w:cs="Times New Roman"/>
+                <w:color w:val="000000"/>
+                <w:kern w:val="0"/>
+                <w:sz w:val="20"/>
+                <w:szCs w:val="20"/>
                 <w:lang w:eastAsia="en-GB"/>
                 <w14:ligatures w14:val="none"/>
               </w:rPr>
             </w:pPr>
             <w:r>
               <w:rPr>
-                <w:rFonts w:ascii="Aptos Narrow" w:eastAsia="Times New Roman" w:hAnsi="Aptos Narrow" w:cs="Times New Roman"/>
-                <w:color w:val="000000"/>
-                <w:kern w:val="0"/>
+                <w:rFonts w:eastAsia="Times New Roman" w:cs="Times New Roman"/>
+                <w:color w:val="000000"/>
+                <w:kern w:val="0"/>
+                <w:sz w:val="20"/>
+                <w:szCs w:val="20"/>
                 <w:lang w:eastAsia="en-GB"/>
                 <w14:ligatures w14:val="none"/>
               </w:rPr>
@@ -2195,18 +2287,22 @@
             <w:pPr>
               <w:spacing w:after="0" w:line="240" w:lineRule="auto"/>
               <w:rPr>
-                <w:rFonts w:ascii="Aptos Narrow" w:eastAsia="Times New Roman" w:hAnsi="Aptos Narrow" w:cs="Times New Roman"/>
-                <w:color w:val="000000"/>
-                <w:kern w:val="0"/>
+                <w:rFonts w:eastAsia="Times New Roman" w:cs="Times New Roman"/>
+                <w:color w:val="000000"/>
+                <w:kern w:val="0"/>
+                <w:sz w:val="20"/>
+                <w:szCs w:val="20"/>
                 <w:lang w:eastAsia="en-GB"/>
                 <w14:ligatures w14:val="none"/>
               </w:rPr>
             </w:pPr>
             <w:r>
               <w:rPr>
-                <w:rFonts w:ascii="Aptos Narrow" w:eastAsia="Times New Roman" w:hAnsi="Aptos Narrow" w:cs="Times New Roman"/>
-                <w:color w:val="000000"/>
-                <w:kern w:val="0"/>
+                <w:rFonts w:eastAsia="Times New Roman" w:cs="Times New Roman"/>
+                <w:color w:val="000000"/>
+                <w:kern w:val="0"/>
+                <w:sz w:val="20"/>
+                <w:szCs w:val="20"/>
                 <w:lang w:eastAsia="en-GB"/>
                 <w14:ligatures w14:val="none"/>
               </w:rPr>
@@ -2231,18 +2327,22 @@
             <w:pPr>
               <w:spacing w:after="0" w:line="240" w:lineRule="auto"/>
               <w:rPr>
-                <w:rFonts w:ascii="Aptos Narrow" w:eastAsia="Times New Roman" w:hAnsi="Aptos Narrow" w:cs="Times New Roman"/>
-                <w:color w:val="000000"/>
-                <w:kern w:val="0"/>
+                <w:rFonts w:eastAsia="Times New Roman" w:cs="Times New Roman"/>
+                <w:color w:val="000000"/>
+                <w:kern w:val="0"/>
+                <w:sz w:val="20"/>
+                <w:szCs w:val="20"/>
                 <w:lang w:eastAsia="en-GB"/>
                 <w14:ligatures w14:val="none"/>
               </w:rPr>
             </w:pPr>
             <w:r>
               <w:rPr>
-                <w:rFonts w:ascii="Aptos Narrow" w:eastAsia="Times New Roman" w:hAnsi="Aptos Narrow" w:cs="Times New Roman"/>
-                <w:color w:val="000000"/>
-                <w:kern w:val="0"/>
+                <w:rFonts w:eastAsia="Times New Roman" w:cs="Times New Roman"/>
+                <w:color w:val="000000"/>
+                <w:kern w:val="0"/>
+                <w:sz w:val="20"/>
+                <w:szCs w:val="20"/>
                 <w:lang w:eastAsia="en-GB"/>
                 <w14:ligatures w14:val="none"/>
               </w:rPr>
@@ -2267,18 +2367,22 @@
             <w:pPr>
               <w:spacing w:after="0" w:line="240" w:lineRule="auto"/>
               <w:rPr>
-                <w:rFonts w:ascii="Aptos Narrow" w:eastAsia="Times New Roman" w:hAnsi="Aptos Narrow" w:cs="Times New Roman"/>
-                <w:color w:val="000000"/>
-                <w:kern w:val="0"/>
+                <w:rFonts w:eastAsia="Times New Roman" w:cs="Times New Roman"/>
+                <w:color w:val="000000"/>
+                <w:kern w:val="0"/>
+                <w:sz w:val="20"/>
+                <w:szCs w:val="20"/>
                 <w:lang w:eastAsia="en-GB"/>
                 <w14:ligatures w14:val="none"/>
               </w:rPr>
             </w:pPr>
             <w:r>
               <w:rPr>
-                <w:rFonts w:ascii="Aptos Narrow" w:eastAsia="Times New Roman" w:hAnsi="Aptos Narrow" w:cs="Times New Roman"/>
-                <w:color w:val="000000"/>
-                <w:kern w:val="0"/>
+                <w:rFonts w:eastAsia="Times New Roman" w:cs="Times New Roman"/>
+                <w:color w:val="000000"/>
+                <w:kern w:val="0"/>
+                <w:sz w:val="20"/>
+                <w:szCs w:val="20"/>
                 <w:lang w:eastAsia="en-GB"/>
                 <w14:ligatures w14:val="none"/>
               </w:rPr>
@@ -2291,6 +2395,10 @@
     <w:p>
       <w:pPr>
         <w:spacing w:after="0"/>
+        <w:rPr>
+          <w:sz w:val="20"/>
+          <w:szCs w:val="20"/>
+        </w:rPr>
       </w:pPr>
     </w:p>
     <w:sectPr>

</xml_diff>